<commit_message>
docs: add NSIS vs MSI comparison table to README and Word doc
Explains who uses each installer format, how to install, what to send
to clients, and admin rights requirements. Notes that Tauri builds both
automatically and only the NSIS .exe goes in the client ZIP.

Co-Authored-By: Claude Sonnet 4.6 <noreply@anthropic.com>
</commit_message>
<xml_diff>
--- a/specifications/ROADMAP_STATUS_2026-06-06.docx
+++ b/specifications/ROADMAP_STATUS_2026-06-06.docx
@@ -1,5 +1,5 @@
 
-<file path=word/document.xml><?xml version="1.0" encoding="UTF-8" standalone="yes"?><w:document xmlns:w="http://schemas.openxmlformats.org/wordprocessingml/2006/main"><w:body><w:p><w:pPr><w:pStyle w:val="Heading1"/></w:pPr><w:r><w:t xml:space="preserve">ARWeb API Tester -- Roadmap Status</w:t></w:r></w:p><w:p><w:pPr><w:pStyle w:val="Normal"/></w:pPr><w:r><w:t xml:space="preserve">Updated: 2026-06-06 | v0.1.2 | ragstack.ch</w:t></w:r></w:p><w:p><w:pPr><w:pStyle w:val="Heading2"/></w:pPr><w:r><w:t xml:space="preserve">Phase Status</w:t></w:r></w:p><w:tbl><w:tblPr><w:tblW w:w="0" w:type="auto"/><w:tblBorders><w:top w:val="single" w:sz="4"/><w:left w:val="single" w:sz="4"/><w:bottom w:val="single" w:sz="4"/><w:right w:val="single" w:sz="4"/><w:insideH w:val="single" w:sz="4"/><w:insideV w:val="single" w:sz="4"/></w:tblBorders></w:tblPr><w:tr><w:tc><w:tcPr><w:shd w:val="clear" w:color="auto" w:fill="E0E0E0"/><w:tcW w:w="0" w:type="auto"/></w:tcPr><w:p><w:r><w:rPr><w:b/></w:rPr><w:t xml:space="preserve">Phase</w:t></w:r></w:p></w:tc><w:tc><w:tcPr><w:shd w:val="clear" w:color="auto" w:fill="E0E0E0"/><w:tcW w:w="0" w:type="auto"/></w:tcPr><w:p><w:r><w:rPr><w:b/></w:rPr><w:t xml:space="preserve">Name</w:t></w:r></w:p></w:tc><w:tc><w:tcPr><w:shd w:val="clear" w:color="auto" w:fill="E0E0E0"/><w:tcW w:w="0" w:type="auto"/></w:tcPr><w:p><w:r><w:rPr><w:b/></w:rPr><w:t xml:space="preserve">Key Deliverable</w:t></w:r></w:p></w:tc><w:tc><w:tcPr><w:shd w:val="clear" w:color="auto" w:fill="E0E0E0"/><w:tcW w:w="0" w:type="auto"/></w:tcPr><w:p><w:r><w:rPr><w:b/></w:rPr><w:t xml:space="preserve">Status</w:t></w:r></w:p></w:tc></w:tr><w:tr><w:tc><w:tcPr><w:tcW w:w="0" w:type="auto"/></w:tcPr><w:p><w:r><w:t xml:space="preserve">0</w:t></w:r></w:p></w:tc><w:tc><w:tcPr><w:tcW w:w="0" w:type="auto"/></w:tcPr><w:p><w:r><w:t xml:space="preserve">Product Definition</w:t></w:r></w:p></w:tc><w:tc><w:tcPr><w:tcW w:w="0" w:type="auto"/></w:tcPr><w:p><w:r><w:t xml:space="preserve">Specs, pilots, architecture docs</w:t></w:r></w:p></w:tc><w:tc><w:tcPr><w:tcW w:w="0" w:type="auto"/></w:tcPr><w:p><w:r><w:t xml:space="preserve">Done</w:t></w:r></w:p></w:tc></w:tr><w:tr><w:tc><w:tcPr><w:tcW w:w="0" w:type="auto"/></w:tcPr><w:p><w:r><w:t xml:space="preserve">1</w:t></w:r></w:p></w:tc><w:tc><w:tcPr><w:tcW w:w="0" w:type="auto"/></w:tcPr><w:p><w:r><w:t xml:space="preserve">Tauri + React Foundation</w:t></w:r></w:p></w:tc><w:tc><w:tcPr><w:tcW w:w="0" w:type="auto"/></w:tcPr><w:p><w:r><w:t xml:space="preserve">Desktop shell, Vite dev server</w:t></w:r></w:p></w:tc><w:tc><w:tcPr><w:tcW w:w="0" w:type="auto"/></w:tcPr><w:p><w:r><w:t xml:space="preserve">Done</w:t></w:r></w:p></w:tc></w:tr><w:tr><w:tc><w:tcPr><w:tcW w:w="0" w:type="auto"/></w:tcPr><w:p><w:r><w:t xml:space="preserve">2</w:t></w:r></w:p></w:tc><w:tc><w:tcPr><w:tcW w:w="0" w:type="auto"/></w:tcPr><w:p><w:r><w:t xml:space="preserve">Domain Model</w:t></w:r></w:p></w:tc><w:tc><w:tcPr><w:tcW w:w="0" w:type="auto"/></w:tcPr><w:p><w:r><w:t xml:space="preserve">20+ TypeScript entities</w:t></w:r></w:p></w:tc><w:tc><w:tcPr><w:tcW w:w="0" w:type="auto"/></w:tcPr><w:p><w:r><w:t xml:space="preserve">Done</w:t></w:r></w:p></w:tc></w:tr><w:tr><w:tc><w:tcPr><w:tcW w:w="0" w:type="auto"/></w:tcPr><w:p><w:r><w:t xml:space="preserve">3</w:t></w:r></w:p></w:tc><w:tc><w:tcPr><w:tcW w:w="0" w:type="auto"/></w:tcPr><w:p><w:r><w:t xml:space="preserve">SQLite Persistence</w:t></w:r></w:p></w:tc><w:tc><w:tcPr><w:tcW w:w="0" w:type="auto"/></w:tcPr><w:p><w:r><w:t xml:space="preserve">19-table schema, WAL, repos</w:t></w:r></w:p></w:tc><w:tc><w:tcPr><w:tcW w:w="0" w:type="auto"/></w:tcPr><w:p><w:r><w:t xml:space="preserve">Done</w:t></w:r></w:p></w:tc></w:tr><w:tr><w:tc><w:tcPr><w:tcW w:w="0" w:type="auto"/></w:tcPr><w:p><w:r><w:t xml:space="preserve">4</w:t></w:r></w:p></w:tc><w:tc><w:tcPr><w:tcW w:w="0" w:type="auto"/></w:tcPr><w:p><w:r><w:t xml:space="preserve">OpenAPI Import</w:t></w:r></w:p></w:tc><w:tc><w:tcPr><w:tcW w:w="0" w:type="auto"/></w:tcPr><w:p><w:r><w:t xml:space="preserve">YAML/JSON recursive scan</w:t></w:r></w:p></w:tc><w:tc><w:tcPr><w:tcW w:w="0" w:type="auto"/></w:tcPr><w:p><w:r><w:t xml:space="preserve">Done</w:t></w:r></w:p></w:tc></w:tr><w:tr><w:tc><w:tcPr><w:tcW w:w="0" w:type="auto"/></w:tcPr><w:p><w:r><w:t xml:space="preserve">5</w:t></w:r></w:p></w:tc><w:tc><w:tcPr><w:tcW w:w="0" w:type="auto"/></w:tcPr><w:p><w:r><w:t xml:space="preserve">Catalog Validator</w:t></w:r></w:p></w:tc><w:tc><w:tcPr><w:tcW w:w="0" w:type="auto"/></w:tcPr><w:p><w:r><w:t xml:space="preserve">Anti-hallucination gate</w:t></w:r></w:p></w:tc><w:tc><w:tcPr><w:tcW w:w="0" w:type="auto"/></w:tcPr><w:p><w:r><w:t xml:space="preserve">Done</w:t></w:r></w:p></w:tc></w:tr><w:tr><w:tc><w:tcPr><w:tcW w:w="0" w:type="auto"/></w:tcPr><w:p><w:r><w:t xml:space="preserve">6</w:t></w:r></w:p></w:tc><w:tc><w:tcPr><w:tcW w:w="0" w:type="auto"/></w:tcPr><w:p><w:r><w:t xml:space="preserve">Banking Taxonomy UI</w:t></w:r></w:p></w:tc><w:tc><w:tcPr><w:tcW w:w="0" w:type="auto"/></w:tcPr><w:p><w:r><w:t xml:space="preserve">25 categories, auto-map on import</w:t></w:r></w:p></w:tc><w:tc><w:tcPr><w:tcW w:w="0" w:type="auto"/></w:tcPr><w:p><w:r><w:t xml:space="preserve">Done</w:t></w:r></w:p></w:tc></w:tr><w:tr><w:tc><w:tcPr><w:tcW w:w="0" w:type="auto"/></w:tcPr><w:p><w:r><w:t xml:space="preserve">Web</w:t></w:r></w:p></w:tc><w:tc><w:tcPr><w:tcW w:w="0" w:type="auto"/></w:tcPr><w:p><w:r><w:t xml:space="preserve">ragstack.ch Deployment</w:t></w:r></w:p></w:tc><w:tc><w:tcPr><w:tcW w:w="0" w:type="auto"/></w:tcPr><w:p><w:r><w:t xml:space="preserve">Docker, nginx, Traefik, HTTPS</w:t></w:r></w:p></w:tc><w:tc><w:tcPr><w:tcW w:w="0" w:type="auto"/></w:tcPr><w:p><w:r><w:t xml:space="preserve">Done</w:t></w:r></w:p></w:tc></w:tr><w:tr><w:tc><w:tcPr><w:tcW w:w="0" w:type="auto"/></w:tcPr><w:p><w:r><w:t xml:space="preserve">8</w:t></w:r></w:p></w:tc><w:tc><w:tcPr><w:tcW w:w="0" w:type="auto"/></w:tcPr><w:p><w:r><w:t xml:space="preserve">BotJob Engine</w:t></w:r></w:p></w:tc><w:tc><w:tcPr><w:tcW w:w="0" w:type="auto"/></w:tcPr><w:p><w:r><w:t xml:space="preserve">CRUD designer, executor, step audit trail</w:t></w:r></w:p></w:tc><w:tc><w:tcPr><w:tcW w:w="0" w:type="auto"/></w:tcPr><w:p><w:r><w:t xml:space="preserve">Done</w:t></w:r></w:p></w:tc></w:tr><w:tr><w:tc><w:tcPr><w:tcW w:w="0" w:type="auto"/></w:tcPr><w:p><w:r><w:t xml:space="preserve">10</w:t></w:r></w:p></w:tc><w:tc><w:tcPr><w:tcW w:w="0" w:type="auto"/></w:tcPr><w:p><w:r><w:t xml:space="preserve">Mock Server UI</w:t></w:r></w:p></w:tc><w:tc><w:tcPr><w:tcW w:w="0" w:type="auto"/></w:tcPr><w:p><w:r><w:t xml:space="preserve">Request log table, stats, clear</w:t></w:r></w:p></w:tc><w:tc><w:tcPr><w:tcW w:w="0" w:type="auto"/></w:tcPr><w:p><w:r><w:t xml:space="preserve">Done</w:t></w:r></w:p></w:tc></w:tr><w:tr><w:tc><w:tcPr><w:tcW w:w="0" w:type="auto"/></w:tcPr><w:p><w:r><w:t xml:space="preserve">11</w:t></w:r></w:p></w:tc><w:tc><w:tcPr><w:tcW w:w="0" w:type="auto"/></w:tcPr><w:p><w:r><w:t xml:space="preserve">AI Layer</w:t></w:r></w:p></w:tc><w:tc><w:tcPr><w:tcW w:w="0" w:type="auto"/></w:tcPr><w:p><w:r><w:t xml:space="preserve">7 providers, Settings page, live routing</w:t></w:r></w:p></w:tc><w:tc><w:tcPr><w:tcW w:w="0" w:type="auto"/></w:tcPr><w:p><w:r><w:t xml:space="preserve">Done</w:t></w:r></w:p></w:tc></w:tr><w:tr><w:tc><w:tcPr><w:tcW w:w="0" w:type="auto"/></w:tcPr><w:p><w:r><w:t xml:space="preserve">7</w:t></w:r></w:p></w:tc><w:tc><w:tcPr><w:tcW w:w="0" w:type="auto"/></w:tcPr><w:p><w:r><w:t xml:space="preserve">Multi-Agent Banking Assistant</w:t></w:r></w:p></w:tc><w:tc><w:tcPr><w:tcW w:w="0" w:type="auto"/></w:tcPr><w:p><w:r><w:t xml:space="preserve">14 agents wired to catalog, evidence</w:t></w:r></w:p></w:tc><w:tc><w:tcPr><w:tcW w:w="0" w:type="auto"/></w:tcPr><w:p><w:r><w:t xml:space="preserve">Done</w:t></w:r></w:p></w:tc></w:tr><w:tr><w:tc><w:tcPr><w:tcW w:w="0" w:type="auto"/></w:tcPr><w:p><w:r><w:t xml:space="preserve">9</w:t></w:r></w:p></w:tc><w:tc><w:tcPr><w:tcW w:w="0" w:type="auto"/></w:tcPr><w:p><w:r><w:t xml:space="preserve">Visual BotJob Designer</w:t></w:r></w:p></w:tc><w:tc><w:tcPr><w:tcW w:w="0" w:type="auto"/></w:tcPr><w:p><w:r><w:t xml:space="preserve">Drag-and-drop canvas</w:t></w:r></w:p></w:tc><w:tc><w:tcPr><w:tcW w:w="0" w:type="auto"/></w:tcPr><w:p><w:r><w:t xml:space="preserve">Pending</w:t></w:r></w:p></w:tc></w:tr><w:tr><w:tc><w:tcPr><w:tcW w:w="0" w:type="auto"/></w:tcPr><w:p><w:r><w:t xml:space="preserve">12</w:t></w:r></w:p></w:tc><w:tc><w:tcPr><w:tcW w:w="0" w:type="auto"/></w:tcPr><w:p><w:r><w:t xml:space="preserve">Reports & Exports</w:t></w:r></w:p></w:tc><w:tc><w:tcPr><w:tcW w:w="0" w:type="auto"/></w:tcPr><w:p><w:r><w:t xml:space="preserve">PDF, Postman collection</w:t></w:r></w:p></w:tc><w:tc><w:tcPr><w:tcW w:w="0" w:type="auto"/></w:tcPr><w:p><w:r><w:t xml:space="preserve">Pending</w:t></w:r></w:p></w:tc></w:tr><w:tr><w:tc><w:tcPr><w:tcW w:w="0" w:type="auto"/></w:tcPr><w:p><w:r><w:t xml:space="preserve">13</w:t></w:r></w:p></w:tc><w:tc><w:tcPr><w:tcW w:w="0" w:type="auto"/></w:tcPr><w:p><w:r><w:t xml:space="preserve">UX Polish</w:t></w:r></w:p></w:tc><w:tc><w:tcPr><w:tcW w:w="0" w:type="auto"/></w:tcPr><w:p><w:r><w:t xml:space="preserve">Loading states, error boundaries</w:t></w:r></w:p></w:tc><w:tc><w:tcPr><w:tcW w:w="0" w:type="auto"/></w:tcPr><w:p><w:r><w:t xml:space="preserve">Pending</w:t></w:r></w:p></w:tc></w:tr><w:tr><w:tc><w:tcPr><w:tcW w:w="0" w:type="auto"/></w:tcPr><w:p><w:r><w:t xml:space="preserve">14</w:t></w:r></w:p></w:tc><w:tc><w:tcPr><w:tcW w:w="0" w:type="auto"/></w:tcPr><w:p><w:r><w:t xml:space="preserve">Security + Tauri exe</w:t></w:r></w:p></w:tc><w:tc><w:tcPr><w:tcW w:w="0" w:type="auto"/></w:tcPr><w:p><w:r><w:t xml:space="preserve">Encrypt keys, sign installer, v1.0</w:t></w:r></w:p></w:tc><w:tc><w:tcPr><w:tcW w:w="0" w:type="auto"/></w:tcPr><w:p><w:r><w:t xml:space="preserve">Pending</w:t></w:r></w:p></w:tc></w:tr></w:tbl><w:p><w:pPr><w:pStyle w:val="Heading2"/></w:pPr><w:r><w:t xml:space="preserve">Windows Desktop Build</w:t></w:r></w:p><w:p><w:pPr><w:pStyle w:val="Normal"/></w:pPr><w:r><w:t xml:space="preserve">Prerequisites (one-time install)</w:t></w:r></w:p><w:tbl><w:tblPr><w:tblW w:w="0" w:type="auto"/><w:tblBorders><w:top w:val="single" w:sz="4"/><w:left w:val="single" w:sz="4"/><w:bottom w:val="single" w:sz="4"/><w:right w:val="single" w:sz="4"/><w:insideH w:val="single" w:sz="4"/><w:insideV w:val="single" w:sz="4"/></w:tblBorders></w:tblPr><w:tr><w:tc><w:tcPr><w:shd w:val="clear" w:color="auto" w:fill="E0E0E0"/><w:tcW w:w="0" w:type="auto"/></w:tcPr><w:p><w:r><w:rPr><w:b/></w:rPr><w:t xml:space="preserve">Tool</w:t></w:r></w:p></w:tc><w:tc><w:tcPr><w:shd w:val="clear" w:color="auto" w:fill="E0E0E0"/><w:tcW w:w="0" w:type="auto"/></w:tcPr><w:p><w:r><w:rPr><w:b/></w:rPr><w:t xml:space="preserve">Notes</w:t></w:r></w:p></w:tc></w:tr><w:tr><w:tc><w:tcPr><w:tcW w:w="0" w:type="auto"/></w:tcPr><w:p><w:r><w:t xml:space="preserve">Node.js 20+</w:t></w:r></w:p></w:tc><w:tc><w:tcPr><w:tcW w:w="0" w:type="auto"/></w:tcPr><w:p><w:r><w:t xml:space="preserve">nodejs.org</w:t></w:r></w:p></w:tc></w:tr><w:tr><w:tc><w:tcPr><w:tcW w:w="0" w:type="auto"/></w:tcPr><w:p><w:r><w:t xml:space="preserve">Rust toolchain</w:t></w:r></w:p></w:tc><w:tc><w:tcPr><w:tcW w:w="0" w:type="auto"/></w:tcPr><w:p><w:r><w:t xml:space="preserve">rustup.rs -- target x86_64-pc-windows-msvc</w:t></w:r></w:p></w:tc></w:tr><w:tr><w:tc><w:tcPr><w:tcW w:w="0" w:type="auto"/></w:tcPr><w:p><w:r><w:t xml:space="preserve">VS Build Tools 2022</w:t></w:r></w:p></w:tc><w:tc><w:tcPr><w:tcW w:w="0" w:type="auto"/></w:tcPr><w:p><w:r><w:t xml:space="preserve">C++ workload required by Tauri/Rust</w:t></w:r></w:p></w:tc></w:tr><w:tr><w:tc><w:tcPr><w:tcW w:w="0" w:type="auto"/></w:tcPr><w:p><w:r><w:t xml:space="preserve">WebView2 Runtime</w:t></w:r></w:p></w:tc><w:tc><w:tcPr><w:tcW w:w="0" w:type="auto"/></w:tcPr><w:p><w:r><w:t xml:space="preserve">Pre-installed on Win 11; download for Win 10</w:t></w:r></w:p></w:tc></w:tr><w:tr><w:tc><w:tcPr><w:tcW w:w="0" w:type="auto"/></w:tcPr><w:p><w:r><w:t xml:space="preserve">Git</w:t></w:r></w:p></w:tc><w:tc><w:tcPr><w:tcW w:w="0" w:type="auto"/></w:tcPr><w:p><w:r><w:t xml:space="preserve">On PATH</w:t></w:r></w:p></w:tc></w:tr></w:tbl><w:p><w:pPr><w:pStyle w:val="Normal"/></w:pPr><w:r><w:rPr><w:b/></w:rPr><w:t xml:space="preserve">First-time setup (run once after cloning or adding new deps):</w:t></w:r></w:p><w:p><w:pPr><w:pStyle w:val="Normal"/></w:pPr><w:r><w:rPr><w:rFonts w:ascii="Courier New" w:hAnsi="Courier New"/><w:sz w:val="18"/></w:rPr><w:t xml:space="preserve">npm install</w:t></w:r></w:p><w:p><w:pPr><w:pStyle w:val="Normal"/></w:pPr><w:r><w:t xml:space="preserve">Installs @yao-pkg/pkg (sidecar bundler) and pins into-stream to v6 (fixes ESM error).</w:t></w:r></w:p><w:p><w:pPr><w:pStyle w:val="Normal"/></w:pPr><w:r><w:rPr><w:b/></w:rPr><w:t xml:space="preserve">Full release (bump + build + package + zip):</w:t></w:r></w:p><w:p><w:pPr><w:pStyle w:val="Normal"/></w:pPr><w:r><w:rPr><w:rFonts w:ascii="Courier New" w:hAnsi="Courier New"/><w:sz w:val="18"/></w:rPr><w:t xml:space="preserve">scripts\release.bat patch</w:t></w:r></w:p><w:p><w:pPr><w:pStyle w:val="Normal"/></w:pPr><w:r><w:t xml:space="preserve">What release.bat does automatically:</w:t></w:r></w:p><w:p><w:pPr><w:pStyle w:val="Normal"/></w:pPr><w:r><w:t xml:space="preserve">1. git pull --rebase -- syncs remote before touching any file</w:t></w:r></w:p><w:p><w:pPr><w:pStyle w:val="Normal"/></w:pPr><w:r><w:t xml:space="preserve">2. Bumps version in package.json / tauri.conf.json / Cargo.toml</w:t></w:r></w:p><w:p><w:pPr><w:pStyle w:val="Normal"/></w:pPr><w:r><w:t xml:space="preserve">3. Builds Node sidecar: esbuild -> @yao-pkg/pkg -> arweb-sidecar.exe</w:t></w:r></w:p><w:p><w:pPr><w:pStyle w:val="Normal"/></w:pPr><w:r><w:t xml:space="preserve">4. Runs npm run tauri:build (Vite + Rust -> .exe + .msi installers)</w:t></w:r></w:p><w:p><w:pPr><w:pStyle w:val="Normal"/></w:pPr><w:r><w:t xml:space="preserve">5. Copies installers to releases\v<ver>\</w:t></w:r></w:p><w:p><w:pPr><w:pStyle w:val="Normal"/></w:pPr><w:r><w:t xml:space="preserve">6. Creates ARWEB-API-Tester-v<ver>-windows-x64.zip (send this to clients)</w:t></w:r></w:p><w:p><w:pPr><w:pStyle w:val="Normal"/></w:pPr><w:r><w:t xml:space="preserve">7. Writes RELEASE.md and updates releases\INDEX.md</w:t></w:r></w:p><w:p><w:pPr><w:pStyle w:val="Normal"/></w:pPr><w:r><w:rPr><w:b/></w:rPr><w:t xml:space="preserve">Other release modes:</w:t></w:r></w:p><w:p><w:pPr><w:pStyle w:val="Normal"/></w:pPr><w:r><w:rPr><w:rFonts w:ascii="Courier New" w:hAnsi="Courier New"/><w:sz w:val="18"/></w:rPr><w:t xml:space="preserve">scripts\release.bat --collect-only   (already built, just collect + zip)</w:t></w:r></w:p><w:p><w:pPr><w:pStyle w:val="Normal"/></w:pPr><w:r><w:rPr><w:rFonts w:ascii="Courier New" w:hAnsi="Courier New"/><w:sz w:val="18"/></w:rPr><w:t xml:space="preserve">scripts\release.bat --skip-bump      (build without bumping version)</w:t></w:r></w:p><w:p><w:pPr><w:pStyle w:val="Normal"/></w:pPr><w:r><w:rPr><w:rFonts w:ascii="Courier New" w:hAnsi="Courier New"/><w:sz w:val="18"/></w:rPr><w:t xml:space="preserve">scripts\build-sidecar.bat            (rebuild sidecar only)</w:t></w:r></w:p><w:p><w:pPr><w:pStyle w:val="Heading2"/></w:pPr><w:r><w:t xml:space="preserve">Known Issues Fixed</w:t></w:r></w:p><w:tbl><w:tblPr><w:tblW w:w="0" w:type="auto"/><w:tblBorders><w:top w:val="single" w:sz="4"/><w:left w:val="single" w:sz="4"/><w:bottom w:val="single" w:sz="4"/><w:right w:val="single" w:sz="4"/><w:insideH w:val="single" w:sz="4"/><w:insideV w:val="single" w:sz="4"/></w:tblBorders></w:tblPr><w:tr><w:tc><w:tcPr><w:shd w:val="clear" w:color="auto" w:fill="E0E0E0"/><w:tcW w:w="0" w:type="auto"/></w:tcPr><w:p><w:r><w:rPr><w:b/></w:rPr><w:t xml:space="preserve">Issue</w:t></w:r></w:p></w:tc><w:tc><w:tcPr><w:shd w:val="clear" w:color="auto" w:fill="E0E0E0"/><w:tcW w:w="0" w:type="auto"/></w:tcPr><w:p><w:r><w:rPr><w:b/></w:rPr><w:t xml:space="preserve">Root Cause</w:t></w:r></w:p></w:tc><w:tc><w:tcPr><w:shd w:val="clear" w:color="auto" w:fill="E0E0E0"/><w:tcW w:w="0" w:type="auto"/></w:tcPr><w:p><w:r><w:rPr><w:b/></w:rPr><w:t xml:space="preserve">Fix</w:t></w:r></w:p></w:tc></w:tr><w:tr><w:tc><w:tcPr><w:tcW w:w="0" w:type="auto"/></w:tcPr><w:p><w:r><w:t xml:space="preserve">Sidecar offline after install</w:t></w:r></w:p></w:tc><w:tc><w:tcPr><w:tcW w:w="0" w:type="auto"/></w:tcPr><w:p><w:r><w:t xml:space="preserve">better-sqlite3 native addon not loadable in Node SEA</w:t></w:r></w:p></w:tc><w:tc><w:tcPr><w:tcW w:w="0" w:type="auto"/></w:tcPr><w:p><w:r><w:t xml:space="preserve">Switched to @yao-pkg/pkg; bundles .node file</w:t></w:r></w:p></w:tc></w:tr><w:tr><w:tc><w:tcPr><w:tcW w:w="0" w:type="auto"/></w:tcPr><w:p><w:r><w:t xml:space="preserve">Wrong SQLite path in production</w:t></w:r></w:p></w:tc><w:tc><w:tcPr><w:tcW w:w="0" w:type="auto"/></w:tcPr><w:p><w:r><w:t xml:space="preserve">container.ts walked up from source path</w:t></w:r></w:p></w:tc><w:tc><w:tcPr><w:tcW w:w="0" w:type="auto"/></w:tcPr><w:p><w:r><w:t xml:space="preserve">Tauri passes DB_PATH=AppData\...\arweb.db</w:t></w:r></w:p></w:tc></w:tr><w:tr><w:tc><w:tcPr><w:tcW w:w="0" w:type="auto"/></w:tcPr><w:p><w:r><w:t xml:space="preserve">Import shows <!doctype html></w:t></w:r></w:p></w:tc><w:tc><w:tcPr><w:tcW w:w="0" w:type="auto"/></w:tcPr><w:p><w:r><w:t xml:space="preserve">Tauri webview has no Vite proxy; /api hit SPA fallback</w:t></w:r></w:p></w:tc><w:tc><w:tcPr><w:tcW w:w="0" w:type="auto"/></w:tcPr><w:p><w:r><w:t xml:space="preserve">sidecarClient detects __TAURI_INTERNALS__ -> http://127.0.0.1:8787</w:t></w:r></w:p></w:tc></w:tr><w:tr><w:tc><w:tcPr><w:tcW w:w="0" w:type="auto"/></w:tcPr><w:p><w:r><w:t xml:space="preserve">ERR_REQUIRE_ESM in sidecar build</w:t></w:r></w:p></w:tc><w:tc><w:tcPr><w:tcW w:w="0" w:type="auto"/></w:tcPr><w:p><w:r><w:t xml:space="preserve">npx @yao-pkg/pkg cached version with ESM into-stream</w:t></w:r></w:p></w:tc><w:tc><w:tcPr><w:tcW w:w="0" w:type="auto"/></w:tcPr><w:p><w:r><w:t xml:space="preserve">Installed locally; into-stream pinned to v6</w:t></w:r></w:p></w:tc></w:tr><w:tr><w:tc><w:tcPr><w:tcW w:w="0" w:type="auto"/></w:tcPr><w:p><w:r><w:t xml:space="preserve">git tag already exists error</w:t></w:r></w:p></w:tc><w:tc><w:tcPr><w:tcW w:w="0" w:type="auto"/></w:tcPr><w:p><w:r><w:t xml:space="preserve">bump-version.bat failed fatally on duplicate tag</w:t></w:r></w:p></w:tc><w:tc><w:tcPr><w:tcW w:w="0" w:type="auto"/></w:tcPr><w:p><w:r><w:t xml:space="preserve">Script checks existence before creating tag</w:t></w:r></w:p></w:tc></w:tr><w:tr><w:tc><w:tcPr><w:tcW w:w="0" w:type="auto"/></w:tcPr><w:p><w:r><w:t xml:space="preserve">Merge conflict in package.json</w:t></w:r></w:p></w:tc><w:tc><w:tcPr><w:tcW w:w="0" w:type="auto"/></w:tcPr><w:p><w:r><w:t xml:space="preserve">Concurrent version bumps on Windows + server</w:t></w:r></w:p></w:tc><w:tc><w:tcPr><w:tcW w:w="0" w:type="auto"/></w:tcPr><w:p><w:r><w:t xml:space="preserve">release.bat opens with git pull --rebase</w:t></w:r></w:p></w:tc></w:tr><w:tr><w:tc><w:tcPr><w:tcW w:w="0" w:type="auto"/></w:tcPr><w:p><w:r><w:t xml:space="preserve">E0597 Rust borrow error</w:t></w:r></w:p></w:tc><w:tc><w:tcPr><w:tcW w:w="0" w:type="auto"/></w:tcPr><w:p><w:r><w:t xml:space="preserve">to_string_lossy() on temporary PathBuf</w:t></w:r></w:p></w:tc><w:tc><w:tcPr><w:tcW w:w="0" w:type="auto"/></w:tcPr><w:p><w:r><w:t xml:space="preserve">Bind PathBuf to named variable first</w:t></w:r></w:p></w:tc></w:tr></w:tbl><w:p><w:pPr><w:pStyle w:val="Heading2"/></w:pPr><w:r><w:t xml:space="preserve">Web Deployment (ragstack.ch)</w:t></w:r></w:p><w:p><w:pPr><w:pStyle w:val="Normal"/></w:pPr><w:r><w:t xml:space="preserve">Architecture:</w:t></w:r></w:p><w:p><w:pPr><w:pStyle w:val="Normal"/></w:pPr><w:r><w:rPr><w:rFonts w:ascii="Courier New" w:hAnsi="Courier New"/><w:sz w:val="18"/></w:rPr><w:t xml:space="preserve">Traefik (HTTPS) -> arweb-web:30880 (nginx) -> arweb-api:8787 (Node) -> /app/data/app.db</w:t></w:r></w:p><w:p><w:pPr><w:pStyle w:val="Normal"/></w:pPr><w:r><w:t xml:space="preserve">Deploy command (on multiserver):</w:t></w:r></w:p><w:p><w:pPr><w:pStyle w:val="Normal"/></w:pPr><w:r><w:rPr><w:rFonts w:ascii="Courier New" w:hAnsi="Courier New"/><w:sz w:val="18"/></w:rPr><w:t xml:space="preserve">cd /srv/projects/ARWeb-Api-Tester</w:t></w:r></w:p><w:p><w:pPr><w:pStyle w:val="Normal"/></w:pPr><w:r><w:rPr><w:rFonts w:ascii="Courier New" w:hAnsi="Courier New"/><w:sz w:val="18"/></w:rPr><w:t xml:space="preserve">git pull</w:t></w:r></w:p><w:p><w:pPr><w:pStyle w:val="Normal"/></w:pPr><w:r><w:rPr><w:rFonts w:ascii="Courier New" w:hAnsi="Courier New"/><w:sz w:val="18"/></w:rPr><w:t xml:space="preserve">docker compose -f docker-compose.ragstack.yml build --no-cache</w:t></w:r></w:p><w:p><w:pPr><w:pStyle w:val="Normal"/></w:pPr><w:r><w:rPr><w:rFonts w:ascii="Courier New" w:hAnsi="Courier New"/><w:sz w:val="18"/></w:rPr><w:t xml:space="preserve">docker compose -f docker-compose.ragstack.yml up -d</w:t></w:r></w:p><w:sectPr/></w:body></w:document>
+<file path=word/document.xml><?xml version="1.0" encoding="UTF-8" standalone="yes"?><w:document xmlns:w="http://schemas.openxmlformats.org/wordprocessingml/2006/main"><w:body><w:p><w:pPr><w:pStyle w:val="Heading1"/></w:pPr><w:r><w:t xml:space="preserve">ARWeb API Tester -- Roadmap Status</w:t></w:r></w:p><w:p><w:pPr><w:pStyle w:val="Normal"/></w:pPr><w:r><w:t xml:space="preserve">Updated: 2026-06-06 | v0.1.2 | ragstack.ch</w:t></w:r></w:p><w:p><w:pPr><w:pStyle w:val="Normal"/></w:pPr><w:r><w:t xml:space="preserve"></w:t></w:r></w:p><w:p><w:pPr><w:pStyle w:val="Heading2"/></w:pPr><w:r><w:t xml:space="preserve">Phase Status</w:t></w:r></w:p><w:tbl><w:tblPr><w:tblW w:w="0" w:type="auto"/><w:tblBorders><w:top w:val="single" w:sz="4"/><w:left w:val="single" w:sz="4"/><w:bottom w:val="single" w:sz="4"/><w:right w:val="single" w:sz="4"/><w:insideH w:val="single" w:sz="4"/><w:insideV w:val="single" w:sz="4"/></w:tblBorders></w:tblPr><w:tr><w:tc><w:tcPr><w:shd w:val="clear" w:color="auto" w:fill="D0D0D0"/><w:tcW w:w="0" w:type="auto"/></w:tcPr><w:p><w:r><w:rPr><w:b/></w:rPr><w:t xml:space="preserve">Phase</w:t></w:r></w:p></w:tc><w:tc><w:tcPr><w:shd w:val="clear" w:color="auto" w:fill="D0D0D0"/><w:tcW w:w="0" w:type="auto"/></w:tcPr><w:p><w:r><w:rPr><w:b/></w:rPr><w:t xml:space="preserve">Name</w:t></w:r></w:p></w:tc><w:tc><w:tcPr><w:shd w:val="clear" w:color="auto" w:fill="D0D0D0"/><w:tcW w:w="0" w:type="auto"/></w:tcPr><w:p><w:r><w:rPr><w:b/></w:rPr><w:t xml:space="preserve">Key Deliverable</w:t></w:r></w:p></w:tc><w:tc><w:tcPr><w:shd w:val="clear" w:color="auto" w:fill="D0D0D0"/><w:tcW w:w="0" w:type="auto"/></w:tcPr><w:p><w:r><w:rPr><w:b/></w:rPr><w:t xml:space="preserve">Status</w:t></w:r></w:p></w:tc></w:tr><w:tr><w:tc><w:tcPr><w:tcW w:w="0" w:type="auto"/></w:tcPr><w:p><w:r><w:t xml:space="preserve">0</w:t></w:r></w:p></w:tc><w:tc><w:tcPr><w:tcW w:w="0" w:type="auto"/></w:tcPr><w:p><w:r><w:t xml:space="preserve">Product Definition</w:t></w:r></w:p></w:tc><w:tc><w:tcPr><w:tcW w:w="0" w:type="auto"/></w:tcPr><w:p><w:r><w:t xml:space="preserve">Specs, pilots, architecture docs</w:t></w:r></w:p></w:tc><w:tc><w:tcPr><w:tcW w:w="0" w:type="auto"/></w:tcPr><w:p><w:r><w:t xml:space="preserve">Done</w:t></w:r></w:p></w:tc></w:tr><w:tr><w:tc><w:tcPr><w:tcW w:w="0" w:type="auto"/></w:tcPr><w:p><w:r><w:t xml:space="preserve">1</w:t></w:r></w:p></w:tc><w:tc><w:tcPr><w:tcW w:w="0" w:type="auto"/></w:tcPr><w:p><w:r><w:t xml:space="preserve">Tauri + React Foundation</w:t></w:r></w:p></w:tc><w:tc><w:tcPr><w:tcW w:w="0" w:type="auto"/></w:tcPr><w:p><w:r><w:t xml:space="preserve">Desktop shell, Vite dev server</w:t></w:r></w:p></w:tc><w:tc><w:tcPr><w:tcW w:w="0" w:type="auto"/></w:tcPr><w:p><w:r><w:t xml:space="preserve">Done</w:t></w:r></w:p></w:tc></w:tr><w:tr><w:tc><w:tcPr><w:tcW w:w="0" w:type="auto"/></w:tcPr><w:p><w:r><w:t xml:space="preserve">2</w:t></w:r></w:p></w:tc><w:tc><w:tcPr><w:tcW w:w="0" w:type="auto"/></w:tcPr><w:p><w:r><w:t xml:space="preserve">Domain Model</w:t></w:r></w:p></w:tc><w:tc><w:tcPr><w:tcW w:w="0" w:type="auto"/></w:tcPr><w:p><w:r><w:t xml:space="preserve">20+ TypeScript entities</w:t></w:r></w:p></w:tc><w:tc><w:tcPr><w:tcW w:w="0" w:type="auto"/></w:tcPr><w:p><w:r><w:t xml:space="preserve">Done</w:t></w:r></w:p></w:tc></w:tr><w:tr><w:tc><w:tcPr><w:tcW w:w="0" w:type="auto"/></w:tcPr><w:p><w:r><w:t xml:space="preserve">3</w:t></w:r></w:p></w:tc><w:tc><w:tcPr><w:tcW w:w="0" w:type="auto"/></w:tcPr><w:p><w:r><w:t xml:space="preserve">SQLite Persistence</w:t></w:r></w:p></w:tc><w:tc><w:tcPr><w:tcW w:w="0" w:type="auto"/></w:tcPr><w:p><w:r><w:t xml:space="preserve">19-table schema, WAL, repos</w:t></w:r></w:p></w:tc><w:tc><w:tcPr><w:tcW w:w="0" w:type="auto"/></w:tcPr><w:p><w:r><w:t xml:space="preserve">Done</w:t></w:r></w:p></w:tc></w:tr><w:tr><w:tc><w:tcPr><w:tcW w:w="0" w:type="auto"/></w:tcPr><w:p><w:r><w:t xml:space="preserve">4</w:t></w:r></w:p></w:tc><w:tc><w:tcPr><w:tcW w:w="0" w:type="auto"/></w:tcPr><w:p><w:r><w:t xml:space="preserve">OpenAPI Import</w:t></w:r></w:p></w:tc><w:tc><w:tcPr><w:tcW w:w="0" w:type="auto"/></w:tcPr><w:p><w:r><w:t xml:space="preserve">YAML/JSON recursive scan</w:t></w:r></w:p></w:tc><w:tc><w:tcPr><w:tcW w:w="0" w:type="auto"/></w:tcPr><w:p><w:r><w:t xml:space="preserve">Done</w:t></w:r></w:p></w:tc></w:tr><w:tr><w:tc><w:tcPr><w:tcW w:w="0" w:type="auto"/></w:tcPr><w:p><w:r><w:t xml:space="preserve">5</w:t></w:r></w:p></w:tc><w:tc><w:tcPr><w:tcW w:w="0" w:type="auto"/></w:tcPr><w:p><w:r><w:t xml:space="preserve">Catalog Validator</w:t></w:r></w:p></w:tc><w:tc><w:tcPr><w:tcW w:w="0" w:type="auto"/></w:tcPr><w:p><w:r><w:t xml:space="preserve">Anti-hallucination gate</w:t></w:r></w:p></w:tc><w:tc><w:tcPr><w:tcW w:w="0" w:type="auto"/></w:tcPr><w:p><w:r><w:t xml:space="preserve">Done</w:t></w:r></w:p></w:tc></w:tr><w:tr><w:tc><w:tcPr><w:tcW w:w="0" w:type="auto"/></w:tcPr><w:p><w:r><w:t xml:space="preserve">6</w:t></w:r></w:p></w:tc><w:tc><w:tcPr><w:tcW w:w="0" w:type="auto"/></w:tcPr><w:p><w:r><w:t xml:space="preserve">Banking Taxonomy UI</w:t></w:r></w:p></w:tc><w:tc><w:tcPr><w:tcW w:w="0" w:type="auto"/></w:tcPr><w:p><w:r><w:t xml:space="preserve">25 categories, auto-map on import</w:t></w:r></w:p></w:tc><w:tc><w:tcPr><w:tcW w:w="0" w:type="auto"/></w:tcPr><w:p><w:r><w:t xml:space="preserve">Done</w:t></w:r></w:p></w:tc></w:tr><w:tr><w:tc><w:tcPr><w:tcW w:w="0" w:type="auto"/></w:tcPr><w:p><w:r><w:t xml:space="preserve">Web</w:t></w:r></w:p></w:tc><w:tc><w:tcPr><w:tcW w:w="0" w:type="auto"/></w:tcPr><w:p><w:r><w:t xml:space="preserve">ragstack.ch Deployment</w:t></w:r></w:p></w:tc><w:tc><w:tcPr><w:tcW w:w="0" w:type="auto"/></w:tcPr><w:p><w:r><w:t xml:space="preserve">Docker, nginx, Traefik, HTTPS</w:t></w:r></w:p></w:tc><w:tc><w:tcPr><w:tcW w:w="0" w:type="auto"/></w:tcPr><w:p><w:r><w:t xml:space="preserve">Done</w:t></w:r></w:p></w:tc></w:tr><w:tr><w:tc><w:tcPr><w:tcW w:w="0" w:type="auto"/></w:tcPr><w:p><w:r><w:t xml:space="preserve">8</w:t></w:r></w:p></w:tc><w:tc><w:tcPr><w:tcW w:w="0" w:type="auto"/></w:tcPr><w:p><w:r><w:t xml:space="preserve">BotJob Engine</w:t></w:r></w:p></w:tc><w:tc><w:tcPr><w:tcW w:w="0" w:type="auto"/></w:tcPr><w:p><w:r><w:t xml:space="preserve">CRUD designer, executor, step audit trail</w:t></w:r></w:p></w:tc><w:tc><w:tcPr><w:tcW w:w="0" w:type="auto"/></w:tcPr><w:p><w:r><w:t xml:space="preserve">Done</w:t></w:r></w:p></w:tc></w:tr><w:tr><w:tc><w:tcPr><w:tcW w:w="0" w:type="auto"/></w:tcPr><w:p><w:r><w:t xml:space="preserve">10</w:t></w:r></w:p></w:tc><w:tc><w:tcPr><w:tcW w:w="0" w:type="auto"/></w:tcPr><w:p><w:r><w:t xml:space="preserve">Mock Server UI</w:t></w:r></w:p></w:tc><w:tc><w:tcPr><w:tcW w:w="0" w:type="auto"/></w:tcPr><w:p><w:r><w:t xml:space="preserve">Request log table, stats, clear</w:t></w:r></w:p></w:tc><w:tc><w:tcPr><w:tcW w:w="0" w:type="auto"/></w:tcPr><w:p><w:r><w:t xml:space="preserve">Done</w:t></w:r></w:p></w:tc></w:tr><w:tr><w:tc><w:tcPr><w:tcW w:w="0" w:type="auto"/></w:tcPr><w:p><w:r><w:t xml:space="preserve">11</w:t></w:r></w:p></w:tc><w:tc><w:tcPr><w:tcW w:w="0" w:type="auto"/></w:tcPr><w:p><w:r><w:t xml:space="preserve">AI Layer</w:t></w:r></w:p></w:tc><w:tc><w:tcPr><w:tcW w:w="0" w:type="auto"/></w:tcPr><w:p><w:r><w:t xml:space="preserve">7 providers, Settings page, live routing</w:t></w:r></w:p></w:tc><w:tc><w:tcPr><w:tcW w:w="0" w:type="auto"/></w:tcPr><w:p><w:r><w:t xml:space="preserve">Done</w:t></w:r></w:p></w:tc></w:tr><w:tr><w:tc><w:tcPr><w:tcW w:w="0" w:type="auto"/></w:tcPr><w:p><w:r><w:t xml:space="preserve">7</w:t></w:r></w:p></w:tc><w:tc><w:tcPr><w:tcW w:w="0" w:type="auto"/></w:tcPr><w:p><w:r><w:t xml:space="preserve">Multi-Agent Banking Assistant</w:t></w:r></w:p></w:tc><w:tc><w:tcPr><w:tcW w:w="0" w:type="auto"/></w:tcPr><w:p><w:r><w:t xml:space="preserve">14 agents wired to catalog, evidence</w:t></w:r></w:p></w:tc><w:tc><w:tcPr><w:tcW w:w="0" w:type="auto"/></w:tcPr><w:p><w:r><w:t xml:space="preserve">Done</w:t></w:r></w:p></w:tc></w:tr><w:tr><w:tc><w:tcPr><w:tcW w:w="0" w:type="auto"/></w:tcPr><w:p><w:r><w:t xml:space="preserve">9</w:t></w:r></w:p></w:tc><w:tc><w:tcPr><w:tcW w:w="0" w:type="auto"/></w:tcPr><w:p><w:r><w:t xml:space="preserve">Visual BotJob Designer</w:t></w:r></w:p></w:tc><w:tc><w:tcPr><w:tcW w:w="0" w:type="auto"/></w:tcPr><w:p><w:r><w:t xml:space="preserve">Drag-and-drop canvas</w:t></w:r></w:p></w:tc><w:tc><w:tcPr><w:tcW w:w="0" w:type="auto"/></w:tcPr><w:p><w:r><w:t xml:space="preserve">Pending</w:t></w:r></w:p></w:tc></w:tr><w:tr><w:tc><w:tcPr><w:tcW w:w="0" w:type="auto"/></w:tcPr><w:p><w:r><w:t xml:space="preserve">12</w:t></w:r></w:p></w:tc><w:tc><w:tcPr><w:tcW w:w="0" w:type="auto"/></w:tcPr><w:p><w:r><w:t xml:space="preserve">Reports & Exports</w:t></w:r></w:p></w:tc><w:tc><w:tcPr><w:tcW w:w="0" w:type="auto"/></w:tcPr><w:p><w:r><w:t xml:space="preserve">PDF, Postman collection</w:t></w:r></w:p></w:tc><w:tc><w:tcPr><w:tcW w:w="0" w:type="auto"/></w:tcPr><w:p><w:r><w:t xml:space="preserve">Pending</w:t></w:r></w:p></w:tc></w:tr><w:tr><w:tc><w:tcPr><w:tcW w:w="0" w:type="auto"/></w:tcPr><w:p><w:r><w:t xml:space="preserve">13</w:t></w:r></w:p></w:tc><w:tc><w:tcPr><w:tcW w:w="0" w:type="auto"/></w:tcPr><w:p><w:r><w:t xml:space="preserve">UX Polish</w:t></w:r></w:p></w:tc><w:tc><w:tcPr><w:tcW w:w="0" w:type="auto"/></w:tcPr><w:p><w:r><w:t xml:space="preserve">Loading states, error boundaries</w:t></w:r></w:p></w:tc><w:tc><w:tcPr><w:tcW w:w="0" w:type="auto"/></w:tcPr><w:p><w:r><w:t xml:space="preserve">Pending</w:t></w:r></w:p></w:tc></w:tr><w:tr><w:tc><w:tcPr><w:tcW w:w="0" w:type="auto"/></w:tcPr><w:p><w:r><w:t xml:space="preserve">14</w:t></w:r></w:p></w:tc><w:tc><w:tcPr><w:tcW w:w="0" w:type="auto"/></w:tcPr><w:p><w:r><w:t xml:space="preserve">Security + Tauri exe</w:t></w:r></w:p></w:tc><w:tc><w:tcPr><w:tcW w:w="0" w:type="auto"/></w:tcPr><w:p><w:r><w:t xml:space="preserve">Encrypt keys, sign installer, v1.0</w:t></w:r></w:p></w:tc><w:tc><w:tcPr><w:tcW w:w="0" w:type="auto"/></w:tcPr><w:p><w:r><w:t xml:space="preserve">Pending</w:t></w:r></w:p></w:tc></w:tr></w:tbl><w:p><w:pPr><w:pStyle w:val="Normal"/></w:pPr><w:r><w:t xml:space="preserve"></w:t></w:r></w:p><w:p><w:pPr><w:pStyle w:val="Heading2"/></w:pPr><w:r><w:t xml:space="preserve">Windows Desktop Build</w:t></w:r></w:p><w:p><w:pPr><w:pStyle w:val="Heading3"/></w:pPr><w:r><w:t xml:space="preserve">Prerequisites (one-time)</w:t></w:r></w:p><w:tbl><w:tblPr><w:tblW w:w="0" w:type="auto"/><w:tblBorders><w:top w:val="single" w:sz="4"/><w:left w:val="single" w:sz="4"/><w:bottom w:val="single" w:sz="4"/><w:right w:val="single" w:sz="4"/><w:insideH w:val="single" w:sz="4"/><w:insideV w:val="single" w:sz="4"/></w:tblBorders></w:tblPr><w:tr><w:tc><w:tcPr><w:shd w:val="clear" w:color="auto" w:fill="D0D0D0"/><w:tcW w:w="0" w:type="auto"/></w:tcPr><w:p><w:r><w:rPr><w:b/></w:rPr><w:t xml:space="preserve">Tool</w:t></w:r></w:p></w:tc><w:tc><w:tcPr><w:shd w:val="clear" w:color="auto" w:fill="D0D0D0"/><w:tcW w:w="0" w:type="auto"/></w:tcPr><w:p><w:r><w:rPr><w:b/></w:rPr><w:t xml:space="preserve">Notes</w:t></w:r></w:p></w:tc></w:tr><w:tr><w:tc><w:tcPr><w:tcW w:w="0" w:type="auto"/></w:tcPr><w:p><w:r><w:t xml:space="preserve">Node.js 20+</w:t></w:r></w:p></w:tc><w:tc><w:tcPr><w:tcW w:w="0" w:type="auto"/></w:tcPr><w:p><w:r><w:t xml:space="preserve">nodejs.org</w:t></w:r></w:p></w:tc></w:tr><w:tr><w:tc><w:tcPr><w:tcW w:w="0" w:type="auto"/></w:tcPr><w:p><w:r><w:t xml:space="preserve">Rust toolchain</w:t></w:r></w:p></w:tc><w:tc><w:tcPr><w:tcW w:w="0" w:type="auto"/></w:tcPr><w:p><w:r><w:t xml:space="preserve">rustup.rs -- target x86_64-pc-windows-msvc</w:t></w:r></w:p></w:tc></w:tr><w:tr><w:tc><w:tcPr><w:tcW w:w="0" w:type="auto"/></w:tcPr><w:p><w:r><w:t xml:space="preserve">VS Build Tools 2022</w:t></w:r></w:p></w:tc><w:tc><w:tcPr><w:tcW w:w="0" w:type="auto"/></w:tcPr><w:p><w:r><w:t xml:space="preserve">C++ workload required by Tauri/Rust</w:t></w:r></w:p></w:tc></w:tr><w:tr><w:tc><w:tcPr><w:tcW w:w="0" w:type="auto"/></w:tcPr><w:p><w:r><w:t xml:space="preserve">WebView2 Runtime</w:t></w:r></w:p></w:tc><w:tc><w:tcPr><w:tcW w:w="0" w:type="auto"/></w:tcPr><w:p><w:r><w:t xml:space="preserve">Pre-installed on Win 11; download for Win 10</w:t></w:r></w:p></w:tc></w:tr><w:tr><w:tc><w:tcPr><w:tcW w:w="0" w:type="auto"/></w:tcPr><w:p><w:r><w:t xml:space="preserve">Git</w:t></w:r></w:p></w:tc><w:tc><w:tcPr><w:tcW w:w="0" w:type="auto"/></w:tcPr><w:p><w:r><w:t xml:space="preserve">On PATH</w:t></w:r></w:p></w:tc></w:tr></w:tbl><w:p><w:pPr><w:pStyle w:val="Normal"/></w:pPr><w:r><w:t xml:space="preserve"></w:t></w:r></w:p><w:p><w:pPr><w:pStyle w:val="Heading3"/></w:pPr><w:r><w:t xml:space="preserve">First-time setup</w:t></w:r></w:p><w:p><w:pPr><w:pStyle w:val="Normal"/></w:pPr><w:r><w:t xml:space="preserve">Run once after cloning or after a git pull that adds new dependencies:</w:t></w:r></w:p><w:p><w:pPr><w:pStyle w:val="Normal"/></w:pPr><w:r><w:rPr><w:rFonts w:ascii="Courier New" w:hAnsi="Courier New"/><w:sz w:val="18"/></w:rPr><w:t xml:space="preserve">    npm install</w:t></w:r></w:p><w:p><w:pPr><w:pStyle w:val="Normal"/></w:pPr><w:r><w:t xml:space="preserve">Installs @yao-pkg/pkg (sidecar bundler) and pins into-stream to v6 to avoid an ESM error on Node 20.</w:t></w:r></w:p><w:p><w:pPr><w:pStyle w:val="Normal"/></w:pPr><w:r><w:t xml:space="preserve"></w:t></w:r></w:p><w:p><w:pPr><w:pStyle w:val="Heading3"/></w:pPr><w:r><w:t xml:space="preserve">Full release workflow</w:t></w:r></w:p><w:p><w:pPr><w:pStyle w:val="Normal"/></w:pPr><w:r><w:rPr><w:rFonts w:ascii="Courier New" w:hAnsi="Courier New"/><w:sz w:val="18"/></w:rPr><w:t xml:space="preserve">    scripts\release.bat patch</w:t></w:r></w:p><w:p><w:pPr><w:pStyle w:val="Normal"/></w:pPr><w:r><w:t xml:space="preserve">What release.bat does automatically:</w:t></w:r></w:p><w:p><w:pPr><w:pStyle w:val="Normal"/></w:pPr><w:r><w:t xml:space="preserve">1. git pull --rebase  --  syncs remote before touching any file (restores lock files first)</w:t></w:r></w:p><w:p><w:pPr><w:pStyle w:val="Normal"/></w:pPr><w:r><w:t xml:space="preserve">2. Bumps package.json / tauri.conf.json / Cargo.toml  (e.g. 0.1.1 -> 0.1.2)</w:t></w:r></w:p><w:p><w:pPr><w:pStyle w:val="Normal"/></w:pPr><w:r><w:t xml:space="preserve">3. Builds Node sidecar: esbuild -> @yao-pkg/pkg -> arweb-sidecar.exe</w:t></w:r></w:p><w:p><w:pPr><w:pStyle w:val="Normal"/></w:pPr><w:r><w:t xml:space="preserve">4. Runs npm run tauri:build  (Vite + Rust -> .exe + .msi installers)</w:t></w:r></w:p><w:p><w:pPr><w:pStyle w:val="Normal"/></w:pPr><w:r><w:t xml:space="preserve">5. Copies installers to releases\v<ver>\</w:t></w:r></w:p><w:p><w:pPr><w:pStyle w:val="Normal"/></w:pPr><w:r><w:t xml:space="preserve">6. Creates ARWEB-API-Tester-v<ver>-windows-x64.zip  --  the file to send to clients</w:t></w:r></w:p><w:p><w:pPr><w:pStyle w:val="Normal"/></w:pPr><w:r><w:t xml:space="preserve">7. Writes releases\v<ver>\RELEASE.md and updates releases\INDEX.md</w:t></w:r></w:p><w:p><w:pPr><w:pStyle w:val="Normal"/></w:pPr><w:r><w:t xml:space="preserve"></w:t></w:r></w:p><w:p><w:pPr><w:pStyle w:val="Heading3"/></w:pPr><w:r><w:t xml:space="preserve">Other release modes</w:t></w:r></w:p><w:p><w:pPr><w:pStyle w:val="Normal"/></w:pPr><w:r><w:rPr><w:rFonts w:ascii="Courier New" w:hAnsi="Courier New"/><w:sz w:val="18"/></w:rPr><w:t xml:space="preserve">    scripts\release.bat --collect-only   (already built, just collect + zip)</w:t></w:r></w:p><w:p><w:pPr><w:pStyle w:val="Normal"/></w:pPr><w:r><w:rPr><w:rFonts w:ascii="Courier New" w:hAnsi="Courier New"/><w:sz w:val="18"/></w:rPr><w:t xml:space="preserve">    scripts\release.bat --skip-bump      (build without bumping version)</w:t></w:r></w:p><w:p><w:pPr><w:pStyle w:val="Normal"/></w:pPr><w:r><w:rPr><w:rFonts w:ascii="Courier New" w:hAnsi="Courier New"/><w:sz w:val="18"/></w:rPr><w:t xml:space="preserve">    scripts\build-sidecar.bat            (rebuild sidecar only)</w:t></w:r></w:p><w:p><w:pPr><w:pStyle w:val="Normal"/></w:pPr><w:r><w:t xml:space="preserve"></w:t></w:r></w:p><w:p><w:pPr><w:pStyle w:val="Heading3"/></w:pPr><w:r><w:t xml:space="preserve">NSIS vs MSI -- which installer file to use</w:t></w:r></w:p><w:tbl><w:tblPr><w:tblW w:w="0" w:type="auto"/><w:tblBorders><w:top w:val="single" w:sz="4"/><w:left w:val="single" w:sz="4"/><w:bottom w:val="single" w:sz="4"/><w:right w:val="single" w:sz="4"/><w:insideH w:val="single" w:sz="4"/><w:insideV w:val="single" w:sz="4"/></w:tblBorders></w:tblPr><w:tr><w:tc><w:tcPr><w:shd w:val="clear" w:color="auto" w:fill="D0D0D0"/><w:tcW w:w="0" w:type="auto"/></w:tcPr><w:p><w:r><w:rPr><w:b/></w:rPr><w:t xml:space="preserve"></w:t></w:r></w:p></w:tc><w:tc><w:tcPr><w:shd w:val="clear" w:color="auto" w:fill="D0D0D0"/><w:tcW w:w="0" w:type="auto"/></w:tcPr><w:p><w:r><w:rPr><w:b/></w:rPr><w:t xml:space="preserve">NSIS .exe</w:t></w:r></w:p></w:tc><w:tc><w:tcPr><w:shd w:val="clear" w:color="auto" w:fill="D0D0D0"/><w:tcW w:w="0" w:type="auto"/></w:tcPr><w:p><w:r><w:rPr><w:b/></w:rPr><w:t xml:space="preserve">MSI .msi</w:t></w:r></w:p></w:tc></w:tr><w:tr><w:tc><w:tcPr><w:tcW w:w="0" w:type="auto"/></w:tcPr><w:p><w:r><w:t xml:space="preserve">Who uses it</w:t></w:r></w:p></w:tc><w:tc><w:tcPr><w:tcW w:w="0" w:type="auto"/></w:tcPr><w:p><w:r><w:t xml:space="preserve">End users / testers</w:t></w:r></w:p></w:tc><w:tc><w:tcPr><w:tcW w:w="0" w:type="auto"/></w:tcPr><w:p><w:r><w:t xml:space="preserve">IT admins</w:t></w:r></w:p></w:tc></w:tr><w:tr><w:tc><w:tcPr><w:tcW w:w="0" w:type="auto"/></w:tcPr><w:p><w:r><w:t xml:space="preserve">How to install</w:t></w:r></w:p></w:tc><w:tc><w:tcPr><w:tcW w:w="0" w:type="auto"/></w:tcPr><w:p><w:r><w:t xml:space="preserve">Double-click</w:t></w:r></w:p></w:tc><w:tc><w:tcPr><w:tcW w:w="0" w:type="auto"/></w:tcPr><w:p><w:r><w:t xml:space="preserve">msiexec /i or Group Policy</w:t></w:r></w:p></w:tc></w:tr><w:tr><w:tc><w:tcPr><w:tcW w:w="0" w:type="auto"/></w:tcPr><w:p><w:r><w:t xml:space="preserve">What to send</w:t></w:r></w:p></w:tc><w:tc><w:tcPr><w:tcW w:w="0" w:type="auto"/></w:tcPr><w:p><w:r><w:t xml:space="preserve">Put in the ZIP</w:t></w:r></w:p></w:tc><w:tc><w:tcPr><w:tcW w:w="0" w:type="auto"/></w:tcPr><w:p><w:r><w:t xml:space="preserve">Only on request</w:t></w:r></w:p></w:tc></w:tr><w:tr><w:tc><w:tcPr><w:tcW w:w="0" w:type="auto"/></w:tcPr><w:p><w:r><w:t xml:space="preserve">Admin rights</w:t></w:r></w:p></w:tc><w:tc><w:tcPr><w:tcW w:w="0" w:type="auto"/></w:tcPr><w:p><w:r><w:t xml:space="preserve">Usually not needed</w:t></w:r></w:p></w:tc><w:tc><w:tcPr><w:tcW w:w="0" w:type="auto"/></w:tcPr><w:p><w:r><w:t xml:space="preserve">Often required</w:t></w:r></w:p></w:tc></w:tr></w:tbl><w:p><w:pPr><w:pStyle w:val="Normal"/></w:pPr><w:r><w:t xml:space="preserve">Tauri builds both automatically. Include only the NSIS .exe in the client ZIP. The MSI sits in releases\v<ver>\ in case an IT team asks for it.</w:t></w:r></w:p><w:p><w:pPr><w:pStyle w:val="Normal"/></w:pPr><w:r><w:t xml:space="preserve"></w:t></w:r></w:p><w:p><w:pPr><w:pStyle w:val="Heading3"/></w:pPr><w:r><w:t xml:space="preserve">Sending to clients</w:t></w:r></w:p><w:p><w:pPr><w:pStyle w:val="Normal"/></w:pPr><w:r><w:t xml:space="preserve">Send the ZIP file from releases\v<ver>\:</w:t></w:r></w:p><w:p><w:pPr><w:pStyle w:val="Normal"/></w:pPr><w:r><w:rPr><w:rFonts w:ascii="Courier New" w:hAnsi="Courier New"/><w:sz w:val="18"/></w:rPr><w:t xml:space="preserve">    ARWEB-API-Tester-v<ver>-windows-x64.zip</w:t></w:r></w:p><w:p><w:pPr><w:pStyle w:val="Normal"/></w:pPr><w:r><w:rPr><w:rFonts w:ascii="Courier New" w:hAnsi="Courier New"/><w:sz w:val="18"/></w:rPr><w:t xml:space="preserve">    └── ARWEB API Tester_<ver>_x64-setup.exe   <-- double-click to install</w:t></w:r></w:p><w:p><w:pPr><w:pStyle w:val="Normal"/></w:pPr><w:r><w:rPr><w:rFonts w:ascii="Courier New" w:hAnsi="Courier New"/><w:sz w:val="18"/></w:rPr><w:t xml:space="preserve">    └── RELEASE.md</w:t></w:r></w:p><w:p><w:pPr><w:pStyle w:val="Normal"/></w:pPr><w:r><w:t xml:space="preserve">Client double-clicks setup.exe. No Node.js or other runtime needed. SQLite database is created at %APPDATA%\com.arweb.apitester\arweb.db.</w:t></w:r></w:p><w:p><w:pPr><w:pStyle w:val="Normal"/></w:pPr><w:r><w:t xml:space="preserve"></w:t></w:r></w:p><w:p><w:pPr><w:pStyle w:val="Heading2"/></w:pPr><w:r><w:t xml:space="preserve">Known Issues Fixed</w:t></w:r></w:p><w:tbl><w:tblPr><w:tblW w:w="0" w:type="auto"/><w:tblBorders><w:top w:val="single" w:sz="4"/><w:left w:val="single" w:sz="4"/><w:bottom w:val="single" w:sz="4"/><w:right w:val="single" w:sz="4"/><w:insideH w:val="single" w:sz="4"/><w:insideV w:val="single" w:sz="4"/></w:tblBorders></w:tblPr><w:tr><w:tc><w:tcPr><w:shd w:val="clear" w:color="auto" w:fill="D0D0D0"/><w:tcW w:w="0" w:type="auto"/></w:tcPr><w:p><w:r><w:rPr><w:b/></w:rPr><w:t xml:space="preserve">Issue</w:t></w:r></w:p></w:tc><w:tc><w:tcPr><w:shd w:val="clear" w:color="auto" w:fill="D0D0D0"/><w:tcW w:w="0" w:type="auto"/></w:tcPr><w:p><w:r><w:rPr><w:b/></w:rPr><w:t xml:space="preserve">Root Cause</w:t></w:r></w:p></w:tc><w:tc><w:tcPr><w:shd w:val="clear" w:color="auto" w:fill="D0D0D0"/><w:tcW w:w="0" w:type="auto"/></w:tcPr><w:p><w:r><w:rPr><w:b/></w:rPr><w:t xml:space="preserve">Fix</w:t></w:r></w:p></w:tc></w:tr><w:tr><w:tc><w:tcPr><w:tcW w:w="0" w:type="auto"/></w:tcPr><w:p><w:r><w:t xml:space="preserve">Sidecar offline after install</w:t></w:r></w:p></w:tc><w:tc><w:tcPr><w:tcW w:w="0" w:type="auto"/></w:tcPr><w:p><w:r><w:t xml:space="preserve">better-sqlite3 native addon not loadable in Node SEA</w:t></w:r></w:p></w:tc><w:tc><w:tcPr><w:tcW w:w="0" w:type="auto"/></w:tcPr><w:p><w:r><w:t xml:space="preserve">Switched to @yao-pkg/pkg -- bundles and extracts .node at runtime</w:t></w:r></w:p></w:tc></w:tr><w:tr><w:tc><w:tcPr><w:tcW w:w="0" w:type="auto"/></w:tcPr><w:p><w:r><w:t xml:space="preserve">Wrong SQLite path in production</w:t></w:r></w:p></w:tc><w:tc><w:tcPr><w:tcW w:w="0" w:type="auto"/></w:tcPr><w:p><w:r><w:t xml:space="preserve">container.ts walked ../../../ from source path</w:t></w:r></w:p></w:tc><w:tc><w:tcPr><w:tcW w:w="0" w:type="auto"/></w:tcPr><w:p><w:r><w:t xml:space="preserve">Tauri passes DB_PATH=AppData\com.arweb.apitester\arweb.db on spawn</w:t></w:r></w:p></w:tc></w:tr><w:tr><w:tc><w:tcPr><w:tcW w:w="0" w:type="auto"/></w:tcPr><w:p><w:r><w:t xml:space="preserve">Import shows <!doctype html> error</w:t></w:r></w:p></w:tc><w:tc><w:tcPr><w:tcW w:w="0" w:type="auto"/></w:tcPr><w:p><w:r><w:t xml:space="preserve">Tauri webview has no Vite proxy; /api/* hit SPA fallback</w:t></w:r></w:p></w:tc><w:tc><w:tcPr><w:tcW w:w="0" w:type="auto"/></w:tcPr><w:p><w:r><w:t xml:space="preserve">sidecarClient detects __TAURI_INTERNALS__ and uses http://127.0.0.1:8787</w:t></w:r></w:p></w:tc></w:tr><w:tr><w:tc><w:tcPr><w:tcW w:w="0" w:type="auto"/></w:tcPr><w:p><w:r><w:t xml:space="preserve">ERR_REQUIRE_ESM during sidecar build</w:t></w:r></w:p></w:tc><w:tc><w:tcPr><w:tcW w:w="0" w:type="auto"/></w:tcPr><w:p><w:r><w:t xml:space="preserve">npx @yao-pkg/pkg cached ESM-incompatible into-stream</w:t></w:r></w:p></w:tc><w:tc><w:tcPr><w:tcW w:w="0" w:type="auto"/></w:tcPr><w:p><w:r><w:t xml:space="preserve">@yao-pkg/pkg installed locally; into-stream pinned to v6 via npm overrides</w:t></w:r></w:p></w:tc></w:tr><w:tr><w:tc><w:tcPr><w:tcW w:w="0" w:type="auto"/></w:tcPr><w:p><w:r><w:t xml:space="preserve">git tag already exists error</w:t></w:r></w:p></w:tc><w:tc><w:tcPr><w:tcW w:w="0" w:type="auto"/></w:tcPr><w:p><w:r><w:t xml:space="preserve">bump-version.bat failed fatally on duplicate tags</w:t></w:r></w:p></w:tc><w:tc><w:tcPr><w:tcW w:w="0" w:type="auto"/></w:tcPr><w:p><w:r><w:t xml:space="preserve">Script checks existence before creating tag</w:t></w:r></w:p></w:tc></w:tr><w:tr><w:tc><w:tcPr><w:tcW w:w="0" w:type="auto"/></w:tcPr><w:p><w:r><w:t xml:space="preserve">Merge conflict in package.json</w:t></w:r></w:p></w:tc><w:tc><w:tcPr><w:tcW w:w="0" w:type="auto"/></w:tcPr><w:p><w:r><w:t xml:space="preserve">Concurrent version bumps on Windows and server</w:t></w:r></w:p></w:tc><w:tc><w:tcPr><w:tcW w:w="0" w:type="auto"/></w:tcPr><w:p><w:r><w:t xml:space="preserve">release.bat opens with git pull --rebase (restores lock files first)</w:t></w:r></w:p></w:tc></w:tr><w:tr><w:tc><w:tcPr><w:tcW w:w="0" w:type="auto"/></w:tcPr><w:p><w:r><w:t xml:space="preserve">E0597 Rust borrow error</w:t></w:r></w:p></w:tc><w:tc><w:tcPr><w:tcW w:w="0" w:type="auto"/></w:tcPr><w:p><w:r><w:t xml:space="preserve">to_string_lossy() on temporary PathBuf</w:t></w:r></w:p></w:tc><w:tc><w:tcPr><w:tcW w:w="0" w:type="auto"/></w:tcPr><w:p><w:r><w:t xml:space="preserve">Bind PathBuf to named variable before calling to_string_lossy()</w:t></w:r></w:p></w:tc></w:tr></w:tbl><w:p><w:pPr><w:pStyle w:val="Normal"/></w:pPr><w:r><w:t xml:space="preserve"></w:t></w:r></w:p><w:p><w:pPr><w:pStyle w:val="Heading2"/></w:pPr><w:r><w:t xml:space="preserve">Web Deployment (ragstack.ch)</w:t></w:r></w:p><w:p><w:pPr><w:pStyle w:val="Normal"/></w:pPr><w:r><w:t xml:space="preserve">Architecture:</w:t></w:r></w:p><w:p><w:pPr><w:pStyle w:val="Normal"/></w:pPr><w:r><w:rPr><w:rFonts w:ascii="Courier New" w:hAnsi="Courier New"/><w:sz w:val="18"/></w:rPr><w:t xml:space="preserve">    Traefik (HTTPS) -> arweb-web:30880 (nginx) -> arweb-api:8787 (Node) -> /app/data/app.db</w:t></w:r></w:p><w:p><w:pPr><w:pStyle w:val="Normal"/></w:pPr><w:r><w:t xml:space="preserve">Deploy command (on multiserver):</w:t></w:r></w:p><w:p><w:pPr><w:pStyle w:val="Normal"/></w:pPr><w:r><w:rPr><w:rFonts w:ascii="Courier New" w:hAnsi="Courier New"/><w:sz w:val="18"/></w:rPr><w:t xml:space="preserve">    cd /srv/projects/ARWeb-Api-Tester</w:t></w:r></w:p><w:p><w:pPr><w:pStyle w:val="Normal"/></w:pPr><w:r><w:rPr><w:rFonts w:ascii="Courier New" w:hAnsi="Courier New"/><w:sz w:val="18"/></w:rPr><w:t xml:space="preserve">    git pull</w:t></w:r></w:p><w:p><w:pPr><w:pStyle w:val="Normal"/></w:pPr><w:r><w:rPr><w:rFonts w:ascii="Courier New" w:hAnsi="Courier New"/><w:sz w:val="18"/></w:rPr><w:t xml:space="preserve">    docker compose -f docker-compose.ragstack.yml build --no-cache</w:t></w:r></w:p><w:p><w:pPr><w:pStyle w:val="Normal"/></w:pPr><w:r><w:rPr><w:rFonts w:ascii="Courier New" w:hAnsi="Courier New"/><w:sz w:val="18"/></w:rPr><w:t xml:space="preserve">    docker compose -f docker-compose.ragstack.yml up -d</w:t></w:r></w:p><w:sectPr/></w:body></w:document>
 </file>
 
 <file path=word/styles.xml><?xml version="1.0" encoding="utf-8"?>
@@ -24,11 +24,11 @@
       <w:sz w:val="26"/>
     </w:rPr>
   </w:style>
-  <w:style w:type="paragraph" w:styleId="Code">
-    <w:name w:val="Code"/>
+  <w:style w:type="paragraph" w:styleId="Heading3">
+    <w:name w:val="heading 3"/>
     <w:rPr>
-      <w:rFonts w:ascii="Courier New" w:hAnsi="Courier New"/>
-      <w:sz w:val="18"/>
+      <w:b/>
+      <w:sz w:val="24"/>
     </w:rPr>
   </w:style>
 </w:styles>

</xml_diff>